<commit_message>
feat: reintroduce Somangi and Moa, refresh shop UI and retire clothing features
</commit_message>
<xml_diff>
--- a/output/opening-dialogue-v1/포포리_마을_초반_대사집_v1.docx
+++ b/output/opening-dialogue-v1/포포리_마을_초반_대사집_v1.docx
@@ -25,7 +25,7 @@
         <w:widowControl/>
       </w:pPr>
       <w:r>
-        <w:t>2026년 10월 22일 대화 정리본</w:t>
+        <w:t>2026년 10월 22일 대화 정리본 · 10월 24일 정류장 장면 수정</w:t>
       </w:r>
     </w:p>
     <w:p>
@@ -96,11 +96,34 @@
         <w:widowControl/>
       </w:pPr>
       <w:r>
-        <w:rPr>
-          <w:color w:val="555555"/>
-          <w:sz w:val="20"/>
-        </w:rPr>
-        <w:t>[진행] 플레이어가 모아 가까이 다가가면 모아가 인기척에 눈을 뜬다.</w:t>
+        <w:t>[2026-10-24 후속] 처음에는 이동 안내문을 표시한다. WASD·방향키로 모아에게 다가가 F 키 또는 말 걸기 버튼으로 세 번 말을 건다.</w:t>
+      </w:r>
+    </w:p>
+    <w:p>
+      <w:pPr>
+        <w:keepLines/>
+        <w:widowControl/>
+      </w:pPr>
+      <w:r>
+        <w:t>[첫 번째 말 걸기] 모아: “으음…… 구름이…… 폭신해…….”</w:t>
+      </w:r>
+    </w:p>
+    <w:p>
+      <w:pPr>
+        <w:keepLines/>
+        <w:widowControl/>
+      </w:pPr>
+      <w:r>
+        <w:t>[두 번째 말 걸기] 모아: “그 베개는…… 내 건데…….”</w:t>
+      </w:r>
+    </w:p>
+    <w:p>
+      <w:pPr>
+        <w:keepLines/>
+        <w:widowControl/>
+      </w:pPr>
+      <w:r>
+        <w:t>[세 번째 말 걸기] 모아가 인기척에 눈을 뜬다. 아래 첫 만남 대사로 연결한다. 가까이 다가가는 것만으로 깨어나지 않는다.</w:t>
       </w:r>
     </w:p>
     <w:p>

</xml_diff>

<commit_message>
feat: refine village board, guided arrival and character movement performance
</commit_message>
<xml_diff>
--- a/output/opening-dialogue-v1/포포리_마을_초반_대사집_v1.docx
+++ b/output/opening-dialogue-v1/포포리_마을_초반_대사집_v1.docx
@@ -11,524 +11,277 @@
       </w:r>
     </w:p>
     <w:p>
-      <w:pPr>
-        <w:keepLines/>
-        <w:widowControl/>
-      </w:pPr>
+      <w:pPr/>
       <w:r>
         <w:t>오프닝 영상 이후부터 첫날 취침까지</w:t>
       </w:r>
     </w:p>
     <w:p>
-      <w:pPr>
-        <w:keepLines/>
-        <w:widowControl/>
-      </w:pPr>
-      <w:r>
-        <w:t>2026년 10월 22일 대화 정리본 · 10월 24일 정류장 장면 수정</w:t>
-      </w:r>
-    </w:p>
-    <w:p>
-      <w:pPr>
-        <w:keepLines/>
-        <w:widowControl/>
-      </w:pPr>
-      <w:r>
-        <w:t>이 문서는 이번 대화에서 작성한 초반 대사와 연출을 모은 검토용 원고다. 게임 적용 완료를 뜻하지 않는다. 소망이는 대본상의 화자 이름이며, 이름 등록 후 주민의 호칭에는 [닉네임]을 사용한다.</w:t>
-      </w:r>
-    </w:p>
-    <w:p>
-      <w:pPr>
-        <w:keepLines/>
-        <w:widowControl/>
-      </w:pPr>
-      <w:r>
-        <w:t>건물별 소개 순서는 변경할 수 있다. 포포리 안내소 소개는 마을 구경의 마지막에 배치한다. 안내소 내부 소개와 대출 세부 조건은 미정으로 비워둔다.</w:t>
-      </w:r>
-    </w:p>
-    <w:p>
-      <w:pPr>
-        <w:keepLines/>
-        <w:widowControl/>
-      </w:pPr>
-      <w:r>
-        <w:t>확정 명칭은 집, 포포리 안내소, 보니 옷장, 새벽달 펍, 우체국, 잎새 증권이다. 증권사 이름은 주식앱과 맞춰 잎새 증권으로 통일한다. 봉봉 잡화점은 기존 이름을 사용하고, 가구점·서점·은행의 새 상호는 이 원고에서 확정하지 않는다.</w:t>
-      </w:r>
+      <w:pPr/>
+      <w:r>
+        <w:t>2026년 10월 22일 대화 정리본 · 10월 25일 소개 동선·서명 전 호칭 수정</w:t>
+      </w:r>
+    </w:p>
+    <w:p>
+      <w:pPr/>
+      <w:r/>
+    </w:p>
+    <w:p>
+      <w:pPr/>
+      <w:r>
+        <w:t>이 문서는 이번 대화에서 작성한 초반 대사와 연출을 모은 검토용 원고다. 게임 적용 완료를 뜻하지 않는다. 소망이는 제작용 화자 표기다. 서명 전 게임 화자명은 ???이며, 대사 본문·집 소개에 플레이어 이름을 쓰지 않는다. 서명 후 주민의 호칭에는 [닉네임]을 사용한다.</w:t>
+      </w:r>
+    </w:p>
+    <w:p>
+      <w:pPr/>
+      <w:r>
+        <w:t>건물별 소개 순서는 변경할 수 있다. 모아 안내소 소개는 마을 구경의 마지막에 배치한다. 안내소 내부 소개와 대출 세부 조건은 미정으로 비워둔다.</w:t>
+      </w:r>
+    </w:p>
+    <w:p>
+      <w:pPr/>
+      <w:r>
+        <w:t>2026-10-25 채택 장소명은 소망이네 집, 모아 안내소, 봉봉 잡화점, 우디 가구점, 토리 증권사, 차곡 은행, 소담 서점, 도란 쉼터, 두리 우체국이다. 보니 옷장 구간은 보존 원고이며 현재 게임 소개에서는 제외한다.</w:t>
+      </w:r>
+    </w:p>
+    <w:p>
+      <w:pPr/>
+      <w:r/>
     </w:p>
     <w:p>
       <w:pPr>
         <w:pStyle w:val="Heading1"/>
-        <w:spacing w:before="320"/>
+        <w:keepLines/>
+        <w:widowControl/>
       </w:pPr>
       <w:r>
         <w:t>1 버스 정류장에서 첫 만남</w:t>
       </w:r>
     </w:p>
     <w:p>
-      <w:pPr>
-        <w:keepLines/>
-        <w:widowControl/>
-      </w:pPr>
-      <w:r>
-        <w:rPr>
-          <w:color w:val="555555"/>
-          <w:sz w:val="20"/>
-        </w:rPr>
+      <w:pPr/>
+      <w:r>
         <w:t>[연출] 오프닝 영상이 끝난 뒤 소망이가 버스에서 내린다. 버스가 떠나고, 정류장 벤치에서 앉은 채 꾸벅꾸벅 졸고 있는 모아가 보인다.</w:t>
       </w:r>
     </w:p>
     <w:p>
-      <w:pPr>
-        <w:keepLines/>
-        <w:widowControl/>
-      </w:pPr>
-      <w:r>
-        <w:rPr>
-          <w:color w:val="555555"/>
-          <w:sz w:val="20"/>
-        </w:rPr>
+      <w:pPr/>
+      <w:r>
         <w:t>[설정] 모아는 새 주민 모집 안내문을 배포한 뒤 매일 정류장에서 다른 요정을 기다려왔다. 소망이의 도착 연락을 미리 받은 상황이 아니다.</w:t>
       </w:r>
     </w:p>
     <w:p>
-      <w:pPr>
-        <w:keepLines/>
-        <w:widowControl/>
-      </w:pPr>
+      <w:pPr/>
       <w:r>
         <w:t>[2026-10-24 후속] 처음에는 이동 안내문을 표시한다. WASD·방향키로 모아에게 다가가 F 키 또는 말 걸기 버튼으로 세 번 말을 건다.</w:t>
       </w:r>
     </w:p>
     <w:p>
-      <w:pPr>
-        <w:keepLines/>
-        <w:widowControl/>
-      </w:pPr>
+      <w:pPr/>
       <w:r>
         <w:t>[첫 번째 말 걸기] 모아: “으음…… 구름이…… 폭신해…….”</w:t>
       </w:r>
     </w:p>
     <w:p>
-      <w:pPr>
-        <w:keepLines/>
-        <w:widowControl/>
-      </w:pPr>
+      <w:pPr/>
       <w:r>
         <w:t>[두 번째 말 걸기] 모아: “그 베개는…… 내 건데…….”</w:t>
       </w:r>
     </w:p>
     <w:p>
-      <w:pPr>
-        <w:keepLines/>
-        <w:widowControl/>
-      </w:pPr>
+      <w:pPr/>
       <w:r>
         <w:t>[세 번째 말 걸기] 모아가 인기척에 눈을 뜬다. 아래 첫 만남 대사로 연결한다. 가까이 다가가는 것만으로 깨어나지 않는다.</w:t>
       </w:r>
     </w:p>
     <w:p>
-      <w:pPr>
-        <w:keepLines/>
-        <w:widowControl/>
-      </w:pPr>
-      <w:r>
-        <w:rPr>
-          <w:b/>
-        </w:rPr>
-        <w:t xml:space="preserve">모아  </w:t>
-      </w:r>
-      <w:r>
-        <w:t>“……음?”</w:t>
-      </w:r>
-    </w:p>
-    <w:p>
-      <w:pPr>
-        <w:keepLines/>
-        <w:widowControl/>
-      </w:pPr>
-      <w:r>
-        <w:rPr>
-          <w:color w:val="555555"/>
-          <w:sz w:val="20"/>
-        </w:rPr>
+      <w:pPr/>
+      <w:r>
+        <w:t>모아: “……음?”</w:t>
+      </w:r>
+    </w:p>
+    <w:p>
+      <w:pPr/>
+      <w:r>
         <w:t>[모션] 소망이를 올려다보다 눈이 커진다.</w:t>
       </w:r>
     </w:p>
     <w:p>
-      <w:pPr>
-        <w:keepLines/>
-        <w:widowControl/>
-      </w:pPr>
-      <w:r>
-        <w:rPr>
-          <w:b/>
-        </w:rPr>
-        <w:t xml:space="preserve">모아  </w:t>
-      </w:r>
-      <w:r>
-        <w:t>“어……!”</w:t>
-      </w:r>
-    </w:p>
-    <w:p>
-      <w:pPr>
-        <w:keepLines/>
-        <w:widowControl/>
-      </w:pPr>
-      <w:r>
-        <w:rPr>
-          <w:color w:val="555555"/>
-          <w:sz w:val="20"/>
-        </w:rPr>
+      <w:pPr/>
+      <w:r>
+        <w:t>모아: “어……!”</w:t>
+      </w:r>
+    </w:p>
+    <w:p>
+      <w:pPr/>
+      <w:r>
         <w:t>[모션] 모아가 벌떡 일어난다.</w:t>
       </w:r>
     </w:p>
     <w:p>
-      <w:pPr>
-        <w:keepLines/>
-        <w:widowControl/>
-      </w:pPr>
-      <w:r>
-        <w:rPr>
-          <w:b/>
-        </w:rPr>
-        <w:t xml:space="preserve">모아  </w:t>
-      </w:r>
-      <w:r>
-        <w:t>“왔다! 드디어 왔어요!”</w:t>
-      </w:r>
-    </w:p>
-    <w:p>
-      <w:pPr>
-        <w:keepLines/>
-        <w:widowControl/>
-      </w:pPr>
-      <w:r>
-        <w:rPr>
-          <w:b/>
-        </w:rPr>
-        <w:t xml:space="preserve">소망이  </w:t>
-      </w:r>
-      <w:r>
-        <w:t>“……나?”</w:t>
-      </w:r>
-    </w:p>
-    <w:p>
-      <w:pPr>
-        <w:keepLines/>
-        <w:widowControl/>
-      </w:pPr>
-      <w:r>
-        <w:rPr>
-          <w:b/>
-        </w:rPr>
-        <w:t xml:space="preserve">모아  </w:t>
-      </w:r>
-      <w:r>
-        <w:t>“네! 혹시 안내문 보고 오셨어요? 포포리 마을에서 새 주민을 찾는다는 안내문이요!”</w:t>
-      </w:r>
-    </w:p>
-    <w:p>
-      <w:pPr>
-        <w:keepLines/>
-        <w:widowControl/>
-      </w:pPr>
-      <w:r>
-        <w:rPr>
-          <w:b/>
-        </w:rPr>
-        <w:t xml:space="preserve">소망이  </w:t>
-      </w:r>
-      <w:r>
-        <w:t>“응. 정류장에 붙어 있던 거.”</w:t>
-      </w:r>
-    </w:p>
-    <w:p>
-      <w:pPr>
-        <w:keepLines/>
-        <w:widowControl/>
-      </w:pPr>
-      <w:r>
-        <w:rPr>
-          <w:b/>
-        </w:rPr>
-        <w:t xml:space="preserve">모아  </w:t>
-      </w:r>
-      <w:r>
-        <w:t>“다행이다…… 아무도 못 봤으면 어쩌나 했어요.”</w:t>
-      </w:r>
-    </w:p>
-    <w:p>
-      <w:pPr>
-        <w:keepLines/>
-        <w:widowControl/>
-      </w:pPr>
-      <w:r>
-        <w:rPr>
-          <w:b/>
-        </w:rPr>
-        <w:t xml:space="preserve">소망이  </w:t>
-      </w:r>
-      <w:r>
-        <w:t>“여기서 기다리고 있었어?”</w:t>
-      </w:r>
-    </w:p>
-    <w:p>
-      <w:pPr>
-        <w:keepLines/>
-        <w:widowControl/>
-      </w:pPr>
-      <w:r>
-        <w:rPr>
-          <w:b/>
-        </w:rPr>
-        <w:t xml:space="preserve">모아  </w:t>
-      </w:r>
-      <w:r>
-        <w:t>“네. 버스가 올 때마다요. 혹시 제가 없을 때 오시면 어디로 가야 할지 모르실 테니까.”</w:t>
-      </w:r>
-    </w:p>
-    <w:p>
-      <w:pPr>
-        <w:keepLines/>
-        <w:widowControl/>
-      </w:pPr>
-      <w:r>
-        <w:rPr>
-          <w:b/>
-        </w:rPr>
-        <w:t xml:space="preserve">소망이  </w:t>
-      </w:r>
-      <w:r>
-        <w:t>“그런데 자고 있었잖아.”</w:t>
-      </w:r>
-    </w:p>
-    <w:p>
-      <w:pPr>
-        <w:keepLines/>
-        <w:widowControl/>
-      </w:pPr>
-      <w:r>
-        <w:rPr>
-          <w:b/>
-        </w:rPr>
-        <w:t xml:space="preserve">모아  </w:t>
-      </w:r>
-      <w:r>
-        <w:t>“……오늘은 조금 졸았어요.”</w:t>
-      </w:r>
-    </w:p>
-    <w:p>
-      <w:pPr>
-        <w:keepLines/>
-        <w:widowControl/>
-      </w:pPr>
-      <w:r>
-        <w:rPr>
-          <w:color w:val="555555"/>
-          <w:sz w:val="20"/>
-        </w:rPr>
+      <w:pPr/>
+      <w:r>
+        <w:t>모아: “왔다! 드디어 왔어요!”</w:t>
+      </w:r>
+    </w:p>
+    <w:p>
+      <w:pPr/>
+      <w:r>
+        <w:t>소망이: “……나?”</w:t>
+      </w:r>
+    </w:p>
+    <w:p>
+      <w:pPr/>
+      <w:r>
+        <w:t>모아: “네! 혹시 안내문 보고 오셨어요? 포포리 마을에서 새 주민을 찾는다는 안내문이요!”</w:t>
+      </w:r>
+    </w:p>
+    <w:p>
+      <w:pPr/>
+      <w:r>
+        <w:t>소망이: “응. 정류장에 붙어 있던 거.”</w:t>
+      </w:r>
+    </w:p>
+    <w:p>
+      <w:pPr/>
+      <w:r>
+        <w:t>모아: “다행이다…… 아무도 못 봤으면 어쩌나 했어요.”</w:t>
+      </w:r>
+    </w:p>
+    <w:p>
+      <w:pPr/>
+      <w:r>
+        <w:t>소망이: “여기서 기다리고 있었어?”</w:t>
+      </w:r>
+    </w:p>
+    <w:p>
+      <w:pPr/>
+      <w:r>
+        <w:t>모아: “네. 버스가 올 때마다요. 혹시 제가 없을 때 오시면 어디로 가야 할지 모르실 테니까.”</w:t>
+      </w:r>
+    </w:p>
+    <w:p>
+      <w:pPr/>
+      <w:r>
+        <w:t>소망이: “그런데 자고 있었잖아.”</w:t>
+      </w:r>
+    </w:p>
+    <w:p>
+      <w:pPr/>
+      <w:r>
+        <w:t>모아: “……오늘은 조금 졸았어요.”</w:t>
+      </w:r>
+    </w:p>
+    <w:p>
+      <w:pPr/>
+      <w:r>
         <w:t>[모션] 모아가 자세를 바로잡는다.</w:t>
       </w:r>
     </w:p>
     <w:p>
-      <w:pPr>
-        <w:keepLines/>
-        <w:widowControl/>
-      </w:pPr>
-      <w:r>
-        <w:rPr>
-          <w:b/>
-        </w:rPr>
-        <w:t xml:space="preserve">모아  </w:t>
-      </w:r>
-      <w:r>
-        <w:t>“아, 인사부터 해야 하는데!”</w:t>
-      </w:r>
-    </w:p>
-    <w:p>
-      <w:pPr>
-        <w:keepLines/>
-        <w:widowControl/>
-      </w:pPr>
-      <w:r>
-        <w:rPr>
-          <w:b/>
-        </w:rPr>
-        <w:t xml:space="preserve">모아  </w:t>
-      </w:r>
-      <w:r>
-        <w:t>“포포리 마을에 오신 걸 환영해요. 저는 정착 안내를 맡은 모아예요!”</w:t>
-      </w:r>
+      <w:pPr/>
+      <w:r>
+        <w:t>모아: “아, 인사부터 해야 하는데!”</w:t>
+      </w:r>
+    </w:p>
+    <w:p>
+      <w:pPr/>
+      <w:r>
+        <w:t>모아: “포포리 마을에 오신 걸 환영해요. 저는 정착 안내를 맡은 모아예요!”</w:t>
+      </w:r>
+    </w:p>
+    <w:p>
+      <w:pPr/>
+      <w:r/>
     </w:p>
     <w:p>
       <w:pPr>
         <w:pStyle w:val="Heading1"/>
-        <w:spacing w:before="320"/>
+        <w:keepLines/>
+        <w:widowControl/>
       </w:pPr>
       <w:r>
         <w:t>2 이름과 이동 안내</w:t>
       </w:r>
     </w:p>
     <w:p>
-      <w:pPr>
-        <w:keepLines/>
-        <w:widowControl/>
-      </w:pPr>
-      <w:r>
-        <w:rPr>
-          <w:b/>
-        </w:rPr>
-        <w:t xml:space="preserve">모아  </w:t>
-      </w:r>
-      <w:r>
-        <w:t>“이름이 뭐예요?”</w:t>
-      </w:r>
-    </w:p>
-    <w:p>
-      <w:pPr>
-        <w:keepLines/>
-        <w:widowControl/>
-      </w:pPr>
-      <w:r>
-        <w:rPr>
-          <w:b/>
-        </w:rPr>
-        <w:t xml:space="preserve">소망이  </w:t>
-      </w:r>
-      <w:r>
-        <w:t>“아직 못 정했어.”</w:t>
-      </w:r>
-    </w:p>
-    <w:p>
-      <w:pPr>
-        <w:keepLines/>
-        <w:widowControl/>
-      </w:pPr>
-      <w:r>
-        <w:rPr>
-          <w:b/>
-        </w:rPr>
-        <w:t xml:space="preserve">모아  </w:t>
-      </w:r>
-      <w:r>
-        <w:t>“그럼 마을을 둘러보는 동안 생각해보는 건 어때요?”</w:t>
-      </w:r>
-    </w:p>
-    <w:p>
-      <w:pPr>
-        <w:keepLines/>
-        <w:widowControl/>
-      </w:pPr>
-      <w:r>
-        <w:rPr>
-          <w:b/>
-        </w:rPr>
-        <w:t xml:space="preserve">소망이  </w:t>
-      </w:r>
-      <w:r>
-        <w:t>“바로 정하지 않아도 돼?”</w:t>
-      </w:r>
-    </w:p>
-    <w:p>
-      <w:pPr>
-        <w:keepLines/>
-        <w:widowControl/>
-      </w:pPr>
-      <w:r>
-        <w:rPr>
-          <w:b/>
-        </w:rPr>
-        <w:t xml:space="preserve">모아  </w:t>
-      </w:r>
-      <w:r>
-        <w:t>“그럼요. 앞으로 계속 불릴 이름인데, 천천히 생각해봐요.”</w:t>
-      </w:r>
-    </w:p>
-    <w:p>
-      <w:pPr>
-        <w:keepLines/>
-        <w:widowControl/>
-      </w:pPr>
-      <w:r>
-        <w:rPr>
-          <w:color w:val="555555"/>
-          <w:sz w:val="20"/>
-        </w:rPr>
+      <w:pPr/>
+      <w:r>
+        <w:t>모아: “이름이 뭐예요?”</w:t>
+      </w:r>
+    </w:p>
+    <w:p>
+      <w:pPr/>
+      <w:r>
+        <w:t>소망이: “아직 못 정했어.”</w:t>
+      </w:r>
+    </w:p>
+    <w:p>
+      <w:pPr/>
+      <w:r>
+        <w:t>모아: “그럼 마을을 둘러보는 동안 생각해보는 건 어때요?”</w:t>
+      </w:r>
+    </w:p>
+    <w:p>
+      <w:pPr/>
+      <w:r>
+        <w:t>소망이: “바로 정하지 않아도 돼?”</w:t>
+      </w:r>
+    </w:p>
+    <w:p>
+      <w:pPr/>
+      <w:r>
+        <w:t>모아: “그럼요. 앞으로 계속 불릴 이름인데, 천천히 생각해봐요.”</w:t>
+      </w:r>
+    </w:p>
+    <w:p>
+      <w:pPr/>
+      <w:r>
         <w:t>[모션] 모아가 마을 쪽으로 몇 걸음 걷다가 돌아본다.</w:t>
       </w:r>
     </w:p>
     <w:p>
-      <w:pPr>
-        <w:keepLines/>
-        <w:widowControl/>
-      </w:pPr>
-      <w:r>
-        <w:rPr>
-          <w:b/>
-        </w:rPr>
-        <w:t xml:space="preserve">모아  </w:t>
-      </w:r>
-      <w:r>
-        <w:t>“우선 어떤 곳인지 보여드릴게요. 같이 가요!”</w:t>
-      </w:r>
-    </w:p>
-    <w:p>
-      <w:pPr>
-        <w:keepLines/>
-        <w:widowControl/>
-      </w:pPr>
-      <w:r>
-        <w:rPr>
-          <w:b/>
-        </w:rPr>
-        <w:t xml:space="preserve">모아  </w:t>
-      </w:r>
-      <w:r>
-        <w:t>“준비됐어요? 먼저 마을 가운데로 가볼까요?”</w:t>
-      </w:r>
-    </w:p>
-    <w:p>
-      <w:pPr>
-        <w:keepLines/>
-        <w:widowControl/>
-      </w:pPr>
-      <w:r>
-        <w:rPr>
-          <w:color w:val="555555"/>
-          <w:sz w:val="20"/>
-        </w:rPr>
+      <w:pPr/>
+      <w:r>
+        <w:t>모아: “우선 어떤 곳인지 보여드릴게요. 같이 가요!”</w:t>
+      </w:r>
+    </w:p>
+    <w:p>
+      <w:pPr/>
+      <w:r>
+        <w:t>모아: “서쪽 길부터 천천히 둘러볼까요? 마지막에 제가 일하는 안내소로 가요.”</w:t>
+      </w:r>
+    </w:p>
+    <w:p>
+      <w:pPr/>
+      <w:r>
         <w:t>[화면 안내] W · A · S · D 키로 움직일 수 있어요.</w:t>
       </w:r>
     </w:p>
     <w:p>
-      <w:pPr>
-        <w:keepLines/>
-        <w:widowControl/>
-      </w:pPr>
-      <w:r>
-        <w:rPr>
-          <w:color w:val="555555"/>
-          <w:sz w:val="20"/>
-        </w:rPr>
+      <w:pPr/>
+      <w:r>
         <w:t>[진행] 소망이가 움직이면 모아도 걸음을 옮긴다. 거리가 벌어지면 모아가 잠시 멈춰 기다린다. 장소별 소개는 짧게 진행한 뒤 다시 걷는다.</w:t>
       </w:r>
     </w:p>
     <w:p>
+      <w:pPr/>
+      <w:r/>
+    </w:p>
+    <w:p>
       <w:pPr>
         <w:pStyle w:val="Heading1"/>
-        <w:spacing w:before="320"/>
+        <w:keepLines/>
+        <w:widowControl/>
       </w:pPr>
       <w:r>
         <w:t>3 마을 구경</w:t>
       </w:r>
     </w:p>
     <w:p>
-      <w:pPr>
-        <w:keepLines/>
-        <w:widowControl/>
-      </w:pPr>
-      <w:r>
-        <w:t>아래 건물별 대사는 이동 순서와 분리해 둔다. 실제 소개 순서는 마을 배치에 맞춰 조정하며 안내소는 마지막에 소개한다.</w:t>
+      <w:pPr/>
+      <w:r>
+        <w:t>[동선] 정류장 → 우디 가구점 → 두리 우체국 → 집 → 포포리 나무 → 토리 증권사 → 도란 쉼터 → 봉봉 잡화점 → 소담 서점 → 차곡 은행 → 주민 게시판 → 모아 안내소. 시설은 밖에서 소개하고 마지막에 안내소로 들어간다.</w:t>
       </w:r>
     </w:p>
     <w:p>
@@ -536,52 +289,109 @@
         <w:pStyle w:val="Heading2"/>
       </w:pPr>
       <w:r>
+        <w:t>우디 가구점</w:t>
+      </w:r>
+    </w:p>
+    <w:p>
+      <w:pPr/>
+      <w:r>
+        <w:t>모아: “먼저 여기는 우디 가구점이에요. 집에 놓을 가구를 고를 수 있어요.”</w:t>
+      </w:r>
+    </w:p>
+    <w:p>
+      <w:pPr/>
+      <w:r>
+        <w:t>소망이: “내가 지낼 집에 놓을 것도?”</w:t>
+      </w:r>
+    </w:p>
+    <w:p>
+      <w:pPr/>
+      <w:r>
+        <w:t>모아: “그럼요. 집은 조금 더 올라가면 보여요. 가는 길에 우체국도 들러봐요.”</w:t>
+      </w:r>
+    </w:p>
+    <w:p>
+      <w:pPr>
+        <w:pStyle w:val="Heading2"/>
+      </w:pPr>
+      <w:r>
+        <w:t>두리 우체국</w:t>
+      </w:r>
+    </w:p>
+    <w:p>
+      <w:pPr/>
+      <w:r>
+        <w:t>모아: “여기는 두리 우체국이에요. 편지나 선물을 보내고 싶으면 두리에게 물어보세요.”</w:t>
+      </w:r>
+    </w:p>
+    <w:p>
+      <w:pPr/>
+      <w:r>
+        <w:t>소망이: “받을 때도 여기로 와?”</w:t>
+      </w:r>
+    </w:p>
+    <w:p>
+      <w:pPr/>
+      <w:r>
+        <w:t>모아: “받는 건 집 앞 우편함을 확인하면 돼요. 이제 그 집을 보여드릴게요.”</w:t>
+      </w:r>
+    </w:p>
+    <w:p>
+      <w:pPr>
+        <w:pStyle w:val="Heading2"/>
+      </w:pPr>
+      <w:r>
+        <w:t>소망이네 집</w:t>
+      </w:r>
+    </w:p>
+    <w:p>
+      <w:pPr/>
+      <w:r>
+        <w:t>[표시] 서명 전 장소명은 ‘앞으로 지낼 집’으로 표시한다. 위 제목은 제작용 장소 식별자다.</w:t>
+      </w:r>
+    </w:p>
+    <w:p>
+      <w:pPr/>
+      <w:r>
+        <w:t>모아: “여기가 앞으로 지낼 집이에요. 집주인분이 세를 내놓고 세계여행을 떠나셨어요.”</w:t>
+      </w:r>
+    </w:p>
+    <w:p>
+      <w:pPr/>
+      <w:r>
+        <w:t>소망이: “세계여행?”</w:t>
+      </w:r>
+    </w:p>
+    <w:p>
+      <w:pPr/>
+      <w:r>
+        <w:t>모아: “네. 가끔 편지나 기념품도 보내주신대요. 안쪽은 나중에 둘러보고, 이번에는 마을 가운데로 가봐요.”</w:t>
+      </w:r>
+    </w:p>
+    <w:p>
+      <w:pPr>
+        <w:pStyle w:val="Heading2"/>
+      </w:pPr>
+      <w:r>
         <w:t>포포리 나무</w:t>
       </w:r>
     </w:p>
     <w:p>
-      <w:pPr>
-        <w:keepLines/>
-        <w:widowControl/>
-      </w:pPr>
-      <w:r>
-        <w:rPr>
-          <w:b/>
-        </w:rPr>
-        <w:t xml:space="preserve">모아  </w:t>
-      </w:r>
-      <w:r>
-        <w:t>“저 큰 나무 보이죠? 포포리 나무예요. 우리 마을 이름도 저 나무에서 따왔어요.”</w:t>
-      </w:r>
-    </w:p>
-    <w:p>
-      <w:pPr>
-        <w:keepLines/>
-        <w:widowControl/>
-      </w:pPr>
-      <w:r>
-        <w:rPr>
-          <w:b/>
-        </w:rPr>
-        <w:t xml:space="preserve">소망이  </w:t>
-      </w:r>
-      <w:r>
-        <w:t>“엄청 크다…….”</w:t>
-      </w:r>
-    </w:p>
-    <w:p>
-      <w:pPr>
-        <w:keepLines/>
-        <w:widowControl/>
-      </w:pPr>
-      <w:r>
-        <w:rPr>
-          <w:b/>
-        </w:rPr>
-        <w:t xml:space="preserve">모아  </w:t>
-      </w:r>
-      <w:r>
-        <w:t>“길이 헷갈리면 저 나무를 찾아오세요. 여기서 다시 출발하면 돼요.”</w:t>
+      <w:pPr/>
+      <w:r>
+        <w:t>모아: “저 큰 나무가 포포리 나무예요. 우리 마을 이름도 저 나무에서 따왔어요.”</w:t>
+      </w:r>
+    </w:p>
+    <w:p>
+      <w:pPr/>
+      <w:r>
+        <w:t>소망이: “엄청 크다…….”</w:t>
+      </w:r>
+    </w:p>
+    <w:p>
+      <w:pPr/>
+      <w:r>
+        <w:t>모아: “길이 헷갈리면 저 나무를 찾아오세요. 이제 북쪽 길로 올라가 볼까요?”</w:t>
       </w:r>
     </w:p>
     <w:p>
@@ -589,52 +399,25 @@
         <w:pStyle w:val="Heading2"/>
       </w:pPr>
       <w:r>
-        <w:t>집</w:t>
-      </w:r>
-    </w:p>
-    <w:p>
-      <w:pPr>
-        <w:keepLines/>
-        <w:widowControl/>
-      </w:pPr>
-      <w:r>
-        <w:rPr>
-          <w:b/>
-        </w:rPr>
-        <w:t xml:space="preserve">모아  </w:t>
-      </w:r>
-      <w:r>
-        <w:t>“여기가 빌려서 지낼 수 있는 집이에요. 집주인분은 세계여행을 떠나셨어요.”</w:t>
-      </w:r>
-    </w:p>
-    <w:p>
-      <w:pPr>
-        <w:keepLines/>
-        <w:widowControl/>
-      </w:pPr>
-      <w:r>
-        <w:rPr>
-          <w:b/>
-        </w:rPr>
-        <w:t xml:space="preserve">소망이  </w:t>
-      </w:r>
-      <w:r>
-        <w:t>“세계여행?”</w:t>
-      </w:r>
-    </w:p>
-    <w:p>
-      <w:pPr>
-        <w:keepLines/>
-        <w:widowControl/>
-      </w:pPr>
-      <w:r>
-        <w:rPr>
-          <w:b/>
-        </w:rPr>
-        <w:t xml:space="preserve">모아  </w:t>
-      </w:r>
-      <w:r>
-        <w:t>“네. 가끔 편지나 기념품도 보내주신대요. 어떤 곳을 여행하고 계실지 궁금하죠?”</w:t>
+        <w:t>토리 증권사</w:t>
+      </w:r>
+    </w:p>
+    <w:p>
+      <w:pPr/>
+      <w:r>
+        <w:t>모아: “여기는 토리 증권사예요. 주식 투자를 배울 수 있는 곳이죠.”</w:t>
+      </w:r>
+    </w:p>
+    <w:p>
+      <w:pPr/>
+      <w:r>
+        <w:t>소망이: “한 번도 해본 적 없는데.”</w:t>
+      </w:r>
+    </w:p>
+    <w:p>
+      <w:pPr/>
+      <w:r>
+        <w:t>모아: “처음이라면 토리에게 물어보세요. 오늘은 위치만 알아두고, 오른쪽 쉼터로 가봐요.”</w:t>
       </w:r>
     </w:p>
     <w:p>
@@ -642,52 +425,51 @@
         <w:pStyle w:val="Heading2"/>
       </w:pPr>
       <w:r>
+        <w:t>도란 쉼터</w:t>
+      </w:r>
+    </w:p>
+    <w:p>
+      <w:pPr/>
+      <w:r>
+        <w:t>모아: “여기는 도란 쉼터예요. 새벽에 문을 열어요.”</w:t>
+      </w:r>
+    </w:p>
+    <w:p>
+      <w:pPr/>
+      <w:r>
+        <w:t>소망이: “다들 자고 있을 때?”</w:t>
+      </w:r>
+    </w:p>
+    <w:p>
+      <w:pPr/>
+      <w:r>
+        <w:t>모아: “아직 잠들기 아쉬운 날도 있잖아요. 그럴 때 들러보세요. 이제 이쪽 길을 따라 내려가요.”</w:t>
+      </w:r>
+    </w:p>
+    <w:p>
+      <w:pPr>
+        <w:pStyle w:val="Heading2"/>
+      </w:pPr>
+      <w:r>
         <w:t>봉봉 잡화점</w:t>
       </w:r>
     </w:p>
     <w:p>
-      <w:pPr>
-        <w:keepLines/>
-        <w:widowControl/>
-      </w:pPr>
-      <w:r>
-        <w:rPr>
-          <w:b/>
-        </w:rPr>
-        <w:t xml:space="preserve">모아  </w:t>
-      </w:r>
-      <w:r>
-        <w:t>“여기는 봉봉 잡화점이에요. 생활에 필요한 물건이나 먹을 걸 살 수 있어요.”</w:t>
-      </w:r>
-    </w:p>
-    <w:p>
-      <w:pPr>
-        <w:keepLines/>
-        <w:widowControl/>
-      </w:pPr>
-      <w:r>
-        <w:rPr>
-          <w:b/>
-        </w:rPr>
-        <w:t xml:space="preserve">소망이  </w:t>
-      </w:r>
-      <w:r>
-        <w:t>“먹을 것도?”</w:t>
-      </w:r>
-    </w:p>
-    <w:p>
-      <w:pPr>
-        <w:keepLines/>
-        <w:widowControl/>
-      </w:pPr>
-      <w:r>
-        <w:rPr>
-          <w:b/>
-        </w:rPr>
-        <w:t xml:space="preserve">모아  </w:t>
-      </w:r>
-      <w:r>
-        <w:t>“네! 나중에 포포리빵도 먹어봐요.”</w:t>
+      <w:pPr/>
+      <w:r>
+        <w:t>모아: “여기는 봉봉 잡화점이에요. 생활에 필요한 물건이나 먹을 걸 살 수 있어요.”</w:t>
+      </w:r>
+    </w:p>
+    <w:p>
+      <w:pPr/>
+      <w:r>
+        <w:t>소망이: “먹을 것도?”</w:t>
+      </w:r>
+    </w:p>
+    <w:p>
+      <w:pPr/>
+      <w:r>
+        <w:t>모아: “네! 나중에 포포리빵도 먹어봐요. 조금 더 내려가면 서점도 있어요.”</w:t>
       </w:r>
     </w:p>
     <w:p>
@@ -695,52 +477,25 @@
         <w:pStyle w:val="Heading2"/>
       </w:pPr>
       <w:r>
-        <w:t>가구점</w:t>
-      </w:r>
-    </w:p>
-    <w:p>
-      <w:pPr>
-        <w:keepLines/>
-        <w:widowControl/>
-      </w:pPr>
-      <w:r>
-        <w:rPr>
-          <w:b/>
-        </w:rPr>
-        <w:t xml:space="preserve">모아  </w:t>
-      </w:r>
-      <w:r>
-        <w:t>“여기는 우디가 운영하는 가구점이에요.”</w:t>
-      </w:r>
-    </w:p>
-    <w:p>
-      <w:pPr>
-        <w:keepLines/>
-        <w:widowControl/>
-      </w:pPr>
-      <w:r>
-        <w:rPr>
-          <w:b/>
-        </w:rPr>
-        <w:t xml:space="preserve">소망이  </w:t>
-      </w:r>
-      <w:r>
-        <w:t>“내 집에 놓을 것도 여기서 고르면 돼?”</w:t>
-      </w:r>
-    </w:p>
-    <w:p>
-      <w:pPr>
-        <w:keepLines/>
-        <w:widowControl/>
-      </w:pPr>
-      <w:r>
-        <w:rPr>
-          <w:b/>
-        </w:rPr>
-        <w:t xml:space="preserve">모아  </w:t>
-      </w:r>
-      <w:r>
-        <w:t>“그럼요. 어떤 방에서 지내고 싶은지 천천히 생각해봐요.”</w:t>
+        <w:t>소담 서점</w:t>
+      </w:r>
+    </w:p>
+    <w:p>
+      <w:pPr/>
+      <w:r>
+        <w:t>모아: “여기는 소담 서점이에요. 어떤 책이 있는지 천천히 구경해보세요.”</w:t>
+      </w:r>
+    </w:p>
+    <w:p>
+      <w:pPr/>
+      <w:r>
+        <w:t>소망이: “무슨 책부터 읽어야 할까?”</w:t>
+      </w:r>
+    </w:p>
+    <w:p>
+      <w:pPr/>
+      <w:r>
+        <w:t>모아: “마음에 드는 제목부터 찾아봐요. 소담에게 물어봐도 좋고요. 다음은 은행이에요.”</w:t>
       </w:r>
     </w:p>
     <w:p>
@@ -748,52 +503,25 @@
         <w:pStyle w:val="Heading2"/>
       </w:pPr>
       <w:r>
-        <w:t>보니 옷장</w:t>
-      </w:r>
-    </w:p>
-    <w:p>
-      <w:pPr>
-        <w:keepLines/>
-        <w:widowControl/>
-      </w:pPr>
-      <w:r>
-        <w:rPr>
-          <w:b/>
-        </w:rPr>
-        <w:t xml:space="preserve">모아  </w:t>
-      </w:r>
-      <w:r>
-        <w:t>“여기는 보니 옷장이에요.”</w:t>
-      </w:r>
-    </w:p>
-    <w:p>
-      <w:pPr>
-        <w:keepLines/>
-        <w:widowControl/>
-      </w:pPr>
-      <w:r>
-        <w:rPr>
-          <w:b/>
-        </w:rPr>
-        <w:t xml:space="preserve">소망이  </w:t>
-      </w:r>
-      <w:r>
-        <w:t>“가게 이름이 옷장이야?”</w:t>
-      </w:r>
-    </w:p>
-    <w:p>
-      <w:pPr>
-        <w:keepLines/>
-        <w:widowControl/>
-      </w:pPr>
-      <w:r>
-        <w:rPr>
-          <w:b/>
-        </w:rPr>
-        <w:t xml:space="preserve">모아  </w:t>
-      </w:r>
-      <w:r>
-        <w:t>“네. 가게 주인 이름이 보니거든요. 보니의 옷장이라는 뜻이에요.”</w:t>
+        <w:t>차곡 은행</w:t>
+      </w:r>
+    </w:p>
+    <w:p>
+      <w:pPr/>
+      <w:r>
+        <w:t>모아: “여기는 차곡 은행이에요. 계좌를 만들거나 생활 자금을 상담할 수 있어요.”</w:t>
+      </w:r>
+    </w:p>
+    <w:p>
+      <w:pPr/>
+      <w:r>
+        <w:t>소망이: “혼자 가도 괜찮아?”</w:t>
+      </w:r>
+    </w:p>
+    <w:p>
+      <w:pPr/>
+      <w:r>
+        <w:t>모아: “그럼요. 처음에는 제가 같이 가드릴게요. 우선 안내소로 돌아가는 길에 게시판부터 볼까요?”</w:t>
       </w:r>
     </w:p>
     <w:p>
@@ -801,52 +529,25 @@
         <w:pStyle w:val="Heading2"/>
       </w:pPr>
       <w:r>
-        <w:t>새벽달 펍</w:t>
-      </w:r>
-    </w:p>
-    <w:p>
-      <w:pPr>
-        <w:keepLines/>
-        <w:widowControl/>
-      </w:pPr>
-      <w:r>
-        <w:rPr>
-          <w:b/>
-        </w:rPr>
-        <w:t xml:space="preserve">모아  </w:t>
-      </w:r>
-      <w:r>
-        <w:t>“여기는 도란이 운영하는 새벽달 펍이에요. 새벽에 문을 열어요.”</w:t>
-      </w:r>
-    </w:p>
-    <w:p>
-      <w:pPr>
-        <w:keepLines/>
-        <w:widowControl/>
-      </w:pPr>
-      <w:r>
-        <w:rPr>
-          <w:b/>
-        </w:rPr>
-        <w:t xml:space="preserve">소망이  </w:t>
-      </w:r>
-      <w:r>
-        <w:t>“다들 자고 있을 때?”</w:t>
-      </w:r>
-    </w:p>
-    <w:p>
-      <w:pPr>
-        <w:keepLines/>
-        <w:widowControl/>
-      </w:pPr>
-      <w:r>
-        <w:rPr>
-          <w:b/>
-        </w:rPr>
-        <w:t xml:space="preserve">모아  </w:t>
-      </w:r>
-      <w:r>
-        <w:t>“아직 잠들기 아쉬운 날도 있잖아요. 그럴 때 들러보세요.”</w:t>
+        <w:t>주민 게시판</w:t>
+      </w:r>
+    </w:p>
+    <w:p>
+      <w:pPr/>
+      <w:r>
+        <w:t>모아: “이건 주민 게시판이에요. 마을 소식이나 잡화점 구인 공고를 확인할 수 있어요.”</w:t>
+      </w:r>
+    </w:p>
+    <w:p>
+      <w:pPr/>
+      <w:r>
+        <w:t>소망이: “일을 구할 때도 여기서 보면 돼?”</w:t>
+      </w:r>
+    </w:p>
+    <w:p>
+      <w:pPr/>
+      <w:r>
+        <w:t>모아: “네. 지금은 위치만 기억해두세요. 바로 옆이 제가 일하는 안내소예요.”</w:t>
       </w:r>
     </w:p>
     <w:p>
@@ -854,293 +555,42 @@
         <w:pStyle w:val="Heading2"/>
       </w:pPr>
       <w:r>
-        <w:t>서점</w:t>
-      </w:r>
-    </w:p>
-    <w:p>
-      <w:pPr>
-        <w:keepLines/>
-        <w:widowControl/>
-      </w:pPr>
-      <w:r>
-        <w:rPr>
-          <w:b/>
-        </w:rPr>
-        <w:t xml:space="preserve">모아  </w:t>
-      </w:r>
-      <w:r>
-        <w:t>“여기는 소담이 운영하는 서점이에요.”</w:t>
-      </w:r>
-    </w:p>
-    <w:p>
-      <w:pPr>
-        <w:keepLines/>
-        <w:widowControl/>
-      </w:pPr>
-      <w:r>
-        <w:rPr>
-          <w:b/>
-        </w:rPr>
-        <w:t xml:space="preserve">소망이  </w:t>
-      </w:r>
-      <w:r>
-        <w:t>“무슨 책부터 읽어야 할까?”</w:t>
-      </w:r>
-    </w:p>
-    <w:p>
-      <w:pPr>
-        <w:keepLines/>
-        <w:widowControl/>
-      </w:pPr>
-      <w:r>
-        <w:rPr>
-          <w:b/>
-        </w:rPr>
-        <w:t xml:space="preserve">모아  </w:t>
-      </w:r>
-      <w:r>
-        <w:t>“마음에 드는 제목부터 찾아봐요. 소담에게 물어봐도 좋고요.”</w:t>
-      </w:r>
-    </w:p>
-    <w:p>
-      <w:pPr>
-        <w:pStyle w:val="Heading2"/>
-      </w:pPr>
-      <w:r>
-        <w:t>우체국</w:t>
-      </w:r>
-    </w:p>
-    <w:p>
-      <w:pPr>
-        <w:keepLines/>
-        <w:widowControl/>
-      </w:pPr>
-      <w:r>
-        <w:rPr>
-          <w:b/>
-        </w:rPr>
-        <w:t xml:space="preserve">모아  </w:t>
-      </w:r>
-      <w:r>
-        <w:t>“편지나 선물을 보내고 싶으면 우체국으로 오세요. 두리가 도와줄 거예요.”</w:t>
-      </w:r>
-    </w:p>
-    <w:p>
-      <w:pPr>
-        <w:keepLines/>
-        <w:widowControl/>
-      </w:pPr>
-      <w:r>
-        <w:rPr>
-          <w:b/>
-        </w:rPr>
-        <w:t xml:space="preserve">소망이  </w:t>
-      </w:r>
-      <w:r>
-        <w:t>“받을 때도 여기로 와?”</w:t>
-      </w:r>
-    </w:p>
-    <w:p>
-      <w:pPr>
-        <w:keepLines/>
-        <w:widowControl/>
-      </w:pPr>
-      <w:r>
-        <w:rPr>
-          <w:b/>
-        </w:rPr>
-        <w:t xml:space="preserve">모아  </w:t>
-      </w:r>
-      <w:r>
-        <w:t>“받는 건 집 앞 우편함을 확인하면 돼요.”</w:t>
-      </w:r>
-    </w:p>
-    <w:p>
-      <w:pPr>
-        <w:pStyle w:val="Heading2"/>
-      </w:pPr>
-      <w:r>
-        <w:t>잎새 증권</w:t>
-      </w:r>
-    </w:p>
-    <w:p>
-      <w:pPr>
-        <w:keepLines/>
-        <w:widowControl/>
-      </w:pPr>
-      <w:r>
-        <w:rPr>
-          <w:b/>
-        </w:rPr>
-        <w:t xml:space="preserve">모아  </w:t>
-      </w:r>
-      <w:r>
-        <w:t>“여기는 잎새 증권이에요. 주식 투자를 배울 수 있는 곳이죠.”</w:t>
-      </w:r>
-    </w:p>
-    <w:p>
-      <w:pPr>
-        <w:keepLines/>
-        <w:widowControl/>
-      </w:pPr>
-      <w:r>
-        <w:rPr>
-          <w:b/>
-        </w:rPr>
-        <w:t xml:space="preserve">소망이  </w:t>
-      </w:r>
-      <w:r>
-        <w:t>“한 번도 해본 적 없는데.”</w:t>
-      </w:r>
-    </w:p>
-    <w:p>
-      <w:pPr>
-        <w:keepLines/>
-        <w:widowControl/>
-      </w:pPr>
-      <w:r>
-        <w:rPr>
-          <w:b/>
-        </w:rPr>
-        <w:t xml:space="preserve">모아  </w:t>
-      </w:r>
-      <w:r>
-        <w:t>“처음이라면 토리에게 물어보세요. 어디서부터 시작하면 되는지 알려줄 거예요.”</w:t>
-      </w:r>
-    </w:p>
-    <w:p>
-      <w:pPr>
-        <w:pStyle w:val="Heading2"/>
-      </w:pPr>
-      <w:r>
-        <w:t>은행</w:t>
-      </w:r>
-    </w:p>
-    <w:p>
-      <w:pPr>
-        <w:keepLines/>
-        <w:widowControl/>
-      </w:pPr>
-      <w:r>
-        <w:rPr>
-          <w:b/>
-        </w:rPr>
-        <w:t xml:space="preserve">모아  </w:t>
-      </w:r>
-      <w:r>
-        <w:t>“여기는 차곡이 있는 은행이에요. 계좌를 만들거나 생활 자금을 상담할 수 있어요.”</w:t>
-      </w:r>
-    </w:p>
-    <w:p>
-      <w:pPr>
-        <w:keepLines/>
-        <w:widowControl/>
-      </w:pPr>
-      <w:r>
-        <w:rPr>
-          <w:b/>
-        </w:rPr>
-        <w:t xml:space="preserve">소망이  </w:t>
-      </w:r>
-      <w:r>
-        <w:t>“혼자 가도 괜찮아?”</w:t>
-      </w:r>
-    </w:p>
-    <w:p>
-      <w:pPr>
-        <w:keepLines/>
-        <w:widowControl/>
-      </w:pPr>
-      <w:r>
-        <w:rPr>
-          <w:b/>
-        </w:rPr>
-        <w:t xml:space="preserve">모아  </w:t>
-      </w:r>
-      <w:r>
-        <w:t>“그럼요. 처음에는 제가 같이 가드릴게요.”</w:t>
-      </w:r>
-    </w:p>
-    <w:p>
-      <w:pPr>
-        <w:pStyle w:val="Heading2"/>
-      </w:pPr>
-      <w:r>
-        <w:t>포포리 안내소</w:t>
-      </w:r>
-    </w:p>
-    <w:p>
-      <w:pPr>
-        <w:keepLines/>
-        <w:widowControl/>
-      </w:pPr>
-      <w:r>
-        <w:rPr>
-          <w:b/>
-        </w:rPr>
-        <w:t xml:space="preserve">모아  </w:t>
-      </w:r>
-      <w:r>
-        <w:t>“마지막으로, 여기가 제가 일하는 포포리 안내소예요.”</w:t>
-      </w:r>
-    </w:p>
-    <w:p>
-      <w:pPr>
-        <w:keepLines/>
-        <w:widowControl/>
-      </w:pPr>
-      <w:r>
-        <w:rPr>
-          <w:b/>
-        </w:rPr>
-        <w:t xml:space="preserve">소망이  </w:t>
-      </w:r>
-      <w:r>
-        <w:t>“정류장에서 일하는 게 아니었어?”</w:t>
-      </w:r>
-    </w:p>
-    <w:p>
-      <w:pPr>
-        <w:keepLines/>
-        <w:widowControl/>
-      </w:pPr>
-      <w:r>
-        <w:rPr>
-          <w:b/>
-        </w:rPr>
-        <w:t xml:space="preserve">모아  </w:t>
-      </w:r>
-      <w:r>
-        <w:t>“아니에요! 거기는 누가 오나 기다리러 나가 있었던 거예요.”</w:t>
-      </w:r>
-    </w:p>
-    <w:p>
-      <w:pPr>
-        <w:keepLines/>
-        <w:widowControl/>
-      </w:pPr>
-      <w:r>
-        <w:rPr>
-          <w:b/>
-        </w:rPr>
-        <w:t xml:space="preserve">모아  </w:t>
-      </w:r>
-      <w:r>
-        <w:t>“앞으로 궁금한 게 생기면 여기로 찾아오세요.”</w:t>
-      </w:r>
-    </w:p>
-    <w:p>
-      <w:pPr>
-        <w:keepLines/>
-        <w:widowControl/>
-      </w:pPr>
-      <w:r>
-        <w:rPr>
-          <w:color w:val="555555"/>
-          <w:sz w:val="20"/>
-        </w:rPr>
-        <w:t>[연결 정리] 이름을 생각했는지 묻는 대사는 중복되지 않도록 실내에서 신청서를 건넨 뒤에 배치한다.</w:t>
-      </w:r>
+        <w:t>모아 안내소</w:t>
+      </w:r>
+    </w:p>
+    <w:p>
+      <w:pPr/>
+      <w:r>
+        <w:t>모아: “마지막으로, 여기가 모아 안내소예요. 안으로 들어가서 입주 신청을 해봐요.”</w:t>
+      </w:r>
+    </w:p>
+    <w:p>
+      <w:pPr/>
+      <w:r>
+        <w:t>소망이: “정류장에서 일하는 게 아니었어?”</w:t>
+      </w:r>
+    </w:p>
+    <w:p>
+      <w:pPr/>
+      <w:r>
+        <w:t>모아: “아니에요! 거기는 누가 오나 기다리러 나가 있었던 거예요.”</w:t>
+      </w:r>
+    </w:p>
+    <w:p>
+      <w:pPr/>
+      <w:r>
+        <w:t>모아: “앞으로 궁금한 게 생기면 여기로 찾아오세요.”</w:t>
+      </w:r>
+    </w:p>
+    <w:p>
+      <w:pPr/>
+      <w:r>
+        <w:t>[연결] 안내소 안에서 신청서를 건넨 뒤 이름을 묻는다. 서명 전에는 플레이어 이름을 부르지 않는다.</w:t>
+      </w:r>
+    </w:p>
+    <w:p>
+      <w:pPr/>
+      <w:r/>
     </w:p>
     <w:p>
       <w:pPr>

</xml_diff>